<commit_message>
fix(template): strip blue text-box shape from Claim Form Example.Docx
Template's document.xml contained a trailing <mc:AlternateContent>
wrapping a <v:shape fillcolor="#2f5496"> (Word's blue accent) — a
decorative blue text box that rendered at the bottom of every generated
Claim Form. Removed the shape-only paragraph via python-docx so future
runs produce shape-free output.

Also captures the user's manual cleanup of the two committed samples,
so examples/claim-form-samples/ stays consistent with live-run output.

Template document.xml: 25013 -> 19075 bytes.
Verified: fresh generate_claim_form() call against Villas produces
17579-byte document.xml with zero occurrences of <v:shape / <w:pict /
<mc:AlternateContent / fillcolor.

Co-Authored-By: Claude Opus 4.7 (1M context) <noreply@anthropic.com>
</commit_message>
<xml_diff>
--- a/Claim Form Example.Docx
+++ b/Claim Form Example.Docx
@@ -747,110 +747,6 @@
           <w:szCs w:val="24"/>
         </w:rPr>
         <w:t xml:space="preserve"> Thank you.</w:t>
-      </w:r>
-    </w:p>
-    <w:p>
-      <w:r>
-        <w:rPr>
-          <w:noProof/>
-        </w:rPr>
-        <mc:AlternateContent>
-          <mc:Choice Requires="wps">
-            <w:drawing>
-              <wp:anchor distT="45720" distB="45720" distL="114300" distR="114300" simplePos="0" relativeHeight="251659264" behindDoc="0" locked="0" layoutInCell="1" allowOverlap="1" wp14:anchorId="4AEBAE6C" wp14:editId="5A55D3CC">
-                <wp:simplePos x="0" y="0"/>
-                <wp:positionH relativeFrom="column">
-                  <wp:posOffset>876300</wp:posOffset>
-                </wp:positionH>
-                <wp:positionV relativeFrom="paragraph">
-                  <wp:posOffset>830580</wp:posOffset>
-                </wp:positionV>
-                <wp:extent cx="6619875" cy="276225"/>
-                <wp:effectExtent l="0" t="0" r="28575" b="28575"/>
-                <wp:wrapNone/>
-                <wp:docPr id="3" name="Text Box 3"/>
-                <wp:cNvGraphicFramePr/>
-                <a:graphic xmlns:a="http://schemas.openxmlformats.org/drawingml/2006/main">
-                  <a:graphicData uri="http://schemas.microsoft.com/office/word/2010/wordprocessingShape">
-                    <wps:wsp>
-                      <wps:cNvSpPr txBox="1"/>
-                      <wps:spPr>
-                        <a:xfrm>
-                          <a:off x="0" y="0"/>
-                          <a:ext cx="6619875" cy="276225"/>
-                        </a:xfrm>
-                        <a:prstGeom prst="rect">
-                          <a:avLst/>
-                        </a:prstGeom>
-                        <a:solidFill>
-                          <a:srgbClr val="2F5496"/>
-                        </a:solidFill>
-                        <a:ln w="9525" cap="flat" cmpd="sng">
-                          <a:solidFill>
-                            <a:srgbClr val="FFFFFF"/>
-                          </a:solidFill>
-                          <a:prstDash val="solid"/>
-                          <a:miter lim="800000"/>
-                          <a:headEnd type="none" w="sm" len="sm"/>
-                          <a:tailEnd type="none" w="sm" len="sm"/>
-                        </a:ln>
-                      </wps:spPr>
-                      <wps:style>
-                        <a:lnRef idx="0">
-                          <a:schemeClr val="accent1"/>
-                        </a:lnRef>
-                        <a:fillRef idx="0">
-                          <a:schemeClr val="accent1"/>
-                        </a:fillRef>
-                        <a:effectRef idx="0">
-                          <a:schemeClr val="accent1"/>
-                        </a:effectRef>
-                        <a:fontRef idx="minor">
-                          <a:schemeClr val="dk1"/>
-                        </a:fontRef>
-                      </wps:style>
-                      <wps:txbx>
-                        <w:txbxContent>
-                          <w:p>
-                            <w:pPr>
-                              <w:spacing w:line="258" w:lineRule="auto"/>
-                            </w:pPr>
-                          </w:p>
-                        </w:txbxContent>
-                      </wps:txbx>
-                      <wps:bodyPr spcFirstLastPara="1" vert="horz" wrap="square" lIns="91425" tIns="45700" rIns="91425" bIns="45700" anchor="t" anchorCtr="0">
-                        <a:noAutofit/>
-                      </wps:bodyPr>
-                    </wps:wsp>
-                  </a:graphicData>
-                </a:graphic>
-                <wp14:sizeRelH relativeFrom="margin">
-                  <wp14:pctWidth>0</wp14:pctWidth>
-                </wp14:sizeRelH>
-              </wp:anchor>
-            </w:drawing>
-          </mc:Choice>
-          <mc:Fallback>
-            <w:pict>
-              <v:shapetype w14:anchorId="4AEBAE6C" id="_x0000_t202" coordsize="21600,21600" o:spt="202" path="m,l,21600r21600,l21600,xe">
-                <v:stroke joinstyle="miter"/>
-                <v:path gradientshapeok="t" o:connecttype="rect"/>
-              </v:shapetype>
-              <v:shape id="Text Box 3" o:spid="_x0000_s1026" type="#_x0000_t202" style="position:absolute;margin-left:69pt;margin-top:65.4pt;width:521.25pt;height:21.75pt;z-index:251659264;visibility:visible;mso-wrap-style:square;mso-width-percent:0;mso-wrap-distance-left:9pt;mso-wrap-distance-top:3.6pt;mso-wrap-distance-right:9pt;mso-wrap-distance-bottom:3.6pt;mso-position-horizontal:absolute;mso-position-horizontal-relative:text;mso-position-vertical:absolute;mso-position-vertical-relative:text;mso-width-percent:0;mso-width-relative:margin;v-text-anchor:top" o:gfxdata="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" fillcolor="#2f5496" strokecolor="white">
-                <v:stroke startarrowwidth="narrow" startarrowlength="short" endarrowwidth="narrow" endarrowlength="short"/>
-                <v:textbox inset="2.53958mm,1.2694mm,2.53958mm,1.2694mm">
-                  <w:txbxContent>
-                    <w:p>
-                      <w:pPr>
-                        <w:spacing w:line="258" w:lineRule="auto"/>
-                      </w:pPr>
-                    </w:p>
-                  </w:txbxContent>
-                </v:textbox>
-              </v:shape>
-            </w:pict>
-          </mc:Fallback>
-        </mc:AlternateContent>
       </w:r>
     </w:p>
     <w:sectPr>

</xml_diff>